<commit_message>
Updated the document content
</commit_message>
<xml_diff>
--- a/LABlogbook_2517680.docx
+++ b/LABlogbook_2517680.docx
@@ -53,7 +53,23 @@
           <w:sz w:val="28"/>
           <w:szCs w:val="28"/>
         </w:rPr>
-        <w:t xml:space="preserve">Student Name: - Madushan Bhashana Dissanayake </w:t>
+        <w:t xml:space="preserve">Student Name: - Madushan </w:t>
+      </w:r>
+      <w:proofErr w:type="spellStart"/>
+      <w:r>
+        <w:rPr>
+          <w:sz w:val="28"/>
+          <w:szCs w:val="28"/>
+        </w:rPr>
+        <w:t>Bhashana</w:t>
+      </w:r>
+      <w:proofErr w:type="spellEnd"/>
+      <w:r>
+        <w:rPr>
+          <w:sz w:val="28"/>
+          <w:szCs w:val="28"/>
+        </w:rPr>
+        <w:t xml:space="preserve"> Dissanayake </w:t>
       </w:r>
     </w:p>
     <w:p>
@@ -694,7 +710,31 @@
           <w:lang w:eastAsia="en-GB"/>
           <w14:ligatures w14:val="none"/>
         </w:rPr>
-        <w:t>A fully connected Dense layer with 128 neurons and ReLU activation was added to learn image features.</w:t>
+        <w:t xml:space="preserve">A fully connected Dense layer with 128 neurons and </w:t>
+      </w:r>
+      <w:proofErr w:type="spellStart"/>
+      <w:r>
+        <w:rPr>
+          <w:rFonts w:eastAsia="Times New Roman" w:cstheme="minorHAnsi"/>
+          <w:kern w:val="0"/>
+          <w:sz w:val="20"/>
+          <w:szCs w:val="20"/>
+          <w:lang w:eastAsia="en-GB"/>
+          <w14:ligatures w14:val="none"/>
+        </w:rPr>
+        <w:t>ReLU</w:t>
+      </w:r>
+      <w:proofErr w:type="spellEnd"/>
+      <w:r>
+        <w:rPr>
+          <w:rFonts w:eastAsia="Times New Roman" w:cstheme="minorHAnsi"/>
+          <w:kern w:val="0"/>
+          <w:sz w:val="20"/>
+          <w:szCs w:val="20"/>
+          <w:lang w:eastAsia="en-GB"/>
+          <w14:ligatures w14:val="none"/>
+        </w:rPr>
+        <w:t xml:space="preserve"> activation was added to learn image features.</w:t>
       </w:r>
     </w:p>
     <w:p>
@@ -848,7 +888,31 @@
           <w:lang w:eastAsia="en-GB"/>
           <w14:ligatures w14:val="none"/>
         </w:rPr>
-        <w:t>The model was compiled using the Adam optimizer and Sparse Categorical Crossentropy loss function.</w:t>
+        <w:t xml:space="preserve">The model was compiled using the Adam optimizer and Sparse Categorical </w:t>
+      </w:r>
+      <w:proofErr w:type="spellStart"/>
+      <w:r>
+        <w:rPr>
+          <w:rFonts w:eastAsia="Times New Roman" w:cstheme="minorHAnsi"/>
+          <w:kern w:val="0"/>
+          <w:sz w:val="20"/>
+          <w:szCs w:val="20"/>
+          <w:lang w:eastAsia="en-GB"/>
+          <w14:ligatures w14:val="none"/>
+        </w:rPr>
+        <w:t>Crossentropy</w:t>
+      </w:r>
+      <w:proofErr w:type="spellEnd"/>
+      <w:r>
+        <w:rPr>
+          <w:rFonts w:eastAsia="Times New Roman" w:cstheme="minorHAnsi"/>
+          <w:kern w:val="0"/>
+          <w:sz w:val="20"/>
+          <w:szCs w:val="20"/>
+          <w:lang w:eastAsia="en-GB"/>
+          <w14:ligatures w14:val="none"/>
+        </w:rPr>
+        <w:t xml:space="preserve"> loss function.</w:t>
       </w:r>
     </w:p>
     <w:p>
@@ -2036,6 +2100,1322 @@
           <w:u w:val="single"/>
         </w:rPr>
       </w:pPr>
+      <w:r>
+        <w:rPr>
+          <w:noProof/>
+        </w:rPr>
+        <w:drawing>
+          <wp:inline distT="0" distB="0" distL="0" distR="0" wp14:anchorId="37C1DBA4" wp14:editId="15AA4FCE">
+            <wp:extent cx="5731510" cy="2879090"/>
+            <wp:effectExtent l="0" t="0" r="2540" b="0"/>
+            <wp:docPr id="872262512" name="Picture 1"/>
+            <wp:cNvGraphicFramePr>
+              <a:graphicFrameLocks xmlns:a="http://schemas.openxmlformats.org/drawingml/2006/main" noChangeAspect="1"/>
+            </wp:cNvGraphicFramePr>
+            <a:graphic xmlns:a="http://schemas.openxmlformats.org/drawingml/2006/main">
+              <a:graphicData uri="http://schemas.openxmlformats.org/drawingml/2006/picture">
+                <pic:pic xmlns:pic="http://schemas.openxmlformats.org/drawingml/2006/picture">
+                  <pic:nvPicPr>
+                    <pic:cNvPr id="0" name="Picture 1"/>
+                    <pic:cNvPicPr>
+                      <a:picLocks noChangeAspect="1" noChangeArrowheads="1"/>
+                    </pic:cNvPicPr>
+                  </pic:nvPicPr>
+                  <pic:blipFill>
+                    <a:blip r:embed="rId5">
+                      <a:extLst>
+                        <a:ext uri="{28A0092B-C50C-407E-A947-70E740481C1C}">
+                          <a14:useLocalDpi xmlns:a14="http://schemas.microsoft.com/office/drawing/2010/main" val="0"/>
+                        </a:ext>
+                      </a:extLst>
+                    </a:blip>
+                    <a:srcRect/>
+                    <a:stretch>
+                      <a:fillRect/>
+                    </a:stretch>
+                  </pic:blipFill>
+                  <pic:spPr bwMode="auto">
+                    <a:xfrm>
+                      <a:off x="0" y="0"/>
+                      <a:ext cx="5731510" cy="2879090"/>
+                    </a:xfrm>
+                    <a:prstGeom prst="rect">
+                      <a:avLst/>
+                    </a:prstGeom>
+                    <a:noFill/>
+                    <a:ln>
+                      <a:noFill/>
+                    </a:ln>
+                  </pic:spPr>
+                </pic:pic>
+              </a:graphicData>
+            </a:graphic>
+          </wp:inline>
+        </w:drawing>
+      </w:r>
+    </w:p>
+    <w:p>
+      <w:pPr>
+        <w:shd w:val="clear" w:color="auto" w:fill="FFFFFF"/>
+        <w:tabs>
+          <w:tab w:val="left" w:pos="916"/>
+          <w:tab w:val="left" w:pos="1832"/>
+          <w:tab w:val="left" w:pos="2748"/>
+          <w:tab w:val="left" w:pos="3664"/>
+          <w:tab w:val="left" w:pos="4580"/>
+          <w:tab w:val="left" w:pos="5496"/>
+          <w:tab w:val="left" w:pos="6412"/>
+          <w:tab w:val="left" w:pos="7328"/>
+          <w:tab w:val="left" w:pos="8244"/>
+          <w:tab w:val="left" w:pos="9160"/>
+          <w:tab w:val="left" w:pos="10076"/>
+          <w:tab w:val="left" w:pos="10992"/>
+          <w:tab w:val="left" w:pos="11908"/>
+          <w:tab w:val="left" w:pos="12824"/>
+          <w:tab w:val="left" w:pos="13740"/>
+          <w:tab w:val="left" w:pos="14656"/>
+        </w:tabs>
+        <w:wordWrap w:val="0"/>
+        <w:spacing w:before="360" w:after="360" w:line="240" w:lineRule="auto"/>
+        <w:ind w:left="480" w:right="480"/>
+        <w:rPr>
+          <w:rFonts w:ascii="Consolas" w:eastAsia="Times New Roman" w:hAnsi="Consolas" w:cs="Courier New"/>
+          <w:kern w:val="0"/>
+          <w:sz w:val="20"/>
+          <w:szCs w:val="20"/>
+          <w:lang w:eastAsia="en-GB"/>
+          <w14:ligatures w14:val="none"/>
+        </w:rPr>
+      </w:pPr>
+      <w:r>
+        <w:rPr>
+          <w:rFonts w:ascii="Consolas" w:eastAsia="Times New Roman" w:hAnsi="Consolas" w:cs="Courier New"/>
+          <w:b/>
+          <w:bCs/>
+          <w:kern w:val="0"/>
+          <w:sz w:val="20"/>
+          <w:szCs w:val="20"/>
+          <w:lang w:eastAsia="en-GB"/>
+          <w14:ligatures w14:val="none"/>
+        </w:rPr>
+        <w:t>Model: "sequential_2"</w:t>
+      </w:r>
+    </w:p>
+    <w:p>
+      <w:pPr>
+        <w:shd w:val="clear" w:color="auto" w:fill="FFFFFF"/>
+        <w:tabs>
+          <w:tab w:val="left" w:pos="916"/>
+          <w:tab w:val="left" w:pos="1832"/>
+          <w:tab w:val="left" w:pos="2748"/>
+          <w:tab w:val="left" w:pos="3664"/>
+          <w:tab w:val="left" w:pos="4580"/>
+          <w:tab w:val="left" w:pos="5496"/>
+          <w:tab w:val="left" w:pos="6412"/>
+          <w:tab w:val="left" w:pos="7328"/>
+          <w:tab w:val="left" w:pos="8244"/>
+          <w:tab w:val="left" w:pos="9160"/>
+          <w:tab w:val="left" w:pos="10076"/>
+          <w:tab w:val="left" w:pos="10992"/>
+          <w:tab w:val="left" w:pos="11908"/>
+          <w:tab w:val="left" w:pos="12824"/>
+          <w:tab w:val="left" w:pos="13740"/>
+          <w:tab w:val="left" w:pos="14656"/>
+        </w:tabs>
+        <w:wordWrap w:val="0"/>
+        <w:spacing w:before="360" w:after="360" w:line="240" w:lineRule="auto"/>
+        <w:ind w:left="480" w:right="480"/>
+        <w:rPr>
+          <w:rFonts w:ascii="Consolas" w:eastAsia="Times New Roman" w:hAnsi="Consolas" w:cs="Courier New"/>
+          <w:kern w:val="0"/>
+          <w:sz w:val="20"/>
+          <w:szCs w:val="20"/>
+          <w:lang w:eastAsia="en-GB"/>
+          <w14:ligatures w14:val="none"/>
+        </w:rPr>
+      </w:pPr>
+      <w:r>
+        <w:rPr>
+          <w:rFonts w:ascii="Consolas" w:eastAsia="Times New Roman" w:hAnsi="Consolas" w:cs="Courier New"/>
+          <w:kern w:val="0"/>
+          <w:sz w:val="20"/>
+          <w:szCs w:val="20"/>
+          <w:lang w:eastAsia="en-GB"/>
+          <w14:ligatures w14:val="none"/>
+        </w:rPr>
+        <w:t>┏━━━━━━━━━━━━━━━━━━━━━━━━━━━━━━━━━┳━━━━━━━━━━━━━━━━━━━━━━━━┳━━━━━━━━━━━━━━━┓</w:t>
+      </w:r>
+    </w:p>
+    <w:p>
+      <w:pPr>
+        <w:shd w:val="clear" w:color="auto" w:fill="FFFFFF"/>
+        <w:tabs>
+          <w:tab w:val="left" w:pos="916"/>
+          <w:tab w:val="left" w:pos="1832"/>
+          <w:tab w:val="left" w:pos="2748"/>
+          <w:tab w:val="left" w:pos="3664"/>
+          <w:tab w:val="left" w:pos="4580"/>
+          <w:tab w:val="left" w:pos="5496"/>
+          <w:tab w:val="left" w:pos="6412"/>
+          <w:tab w:val="left" w:pos="7328"/>
+          <w:tab w:val="left" w:pos="8244"/>
+          <w:tab w:val="left" w:pos="9160"/>
+          <w:tab w:val="left" w:pos="10076"/>
+          <w:tab w:val="left" w:pos="10992"/>
+          <w:tab w:val="left" w:pos="11908"/>
+          <w:tab w:val="left" w:pos="12824"/>
+          <w:tab w:val="left" w:pos="13740"/>
+          <w:tab w:val="left" w:pos="14656"/>
+        </w:tabs>
+        <w:wordWrap w:val="0"/>
+        <w:spacing w:before="360" w:after="360" w:line="240" w:lineRule="auto"/>
+        <w:ind w:left="480" w:right="480"/>
+        <w:rPr>
+          <w:rFonts w:ascii="Consolas" w:eastAsia="Times New Roman" w:hAnsi="Consolas" w:cs="Courier New"/>
+          <w:kern w:val="0"/>
+          <w:sz w:val="20"/>
+          <w:szCs w:val="20"/>
+          <w:lang w:eastAsia="en-GB"/>
+          <w14:ligatures w14:val="none"/>
+        </w:rPr>
+      </w:pPr>
+      <w:r>
+        <w:rPr>
+          <w:rFonts w:ascii="Consolas" w:eastAsia="Times New Roman" w:hAnsi="Consolas" w:cs="Courier New"/>
+          <w:kern w:val="0"/>
+          <w:sz w:val="20"/>
+          <w:szCs w:val="20"/>
+          <w:lang w:eastAsia="en-GB"/>
+          <w14:ligatures w14:val="none"/>
+        </w:rPr>
+        <w:t>┃</w:t>
+      </w:r>
+      <w:r>
+        <w:rPr>
+          <w:rFonts w:ascii="Consolas" w:eastAsia="Times New Roman" w:hAnsi="Consolas" w:cs="Courier New"/>
+          <w:b/>
+          <w:bCs/>
+          <w:kern w:val="0"/>
+          <w:sz w:val="20"/>
+          <w:szCs w:val="20"/>
+          <w:lang w:eastAsia="en-GB"/>
+          <w14:ligatures w14:val="none"/>
+        </w:rPr>
+        <w:t xml:space="preserve"> Layer (type)                    </w:t>
+      </w:r>
+      <w:r>
+        <w:rPr>
+          <w:rFonts w:ascii="Consolas" w:eastAsia="Times New Roman" w:hAnsi="Consolas" w:cs="Courier New"/>
+          <w:kern w:val="0"/>
+          <w:sz w:val="20"/>
+          <w:szCs w:val="20"/>
+          <w:lang w:eastAsia="en-GB"/>
+          <w14:ligatures w14:val="none"/>
+        </w:rPr>
+        <w:t>┃</w:t>
+      </w:r>
+      <w:r>
+        <w:rPr>
+          <w:rFonts w:ascii="Consolas" w:eastAsia="Times New Roman" w:hAnsi="Consolas" w:cs="Courier New"/>
+          <w:b/>
+          <w:bCs/>
+          <w:kern w:val="0"/>
+          <w:sz w:val="20"/>
+          <w:szCs w:val="20"/>
+          <w:lang w:eastAsia="en-GB"/>
+          <w14:ligatures w14:val="none"/>
+        </w:rPr>
+        <w:t xml:space="preserve"> Output Shape           </w:t>
+      </w:r>
+      <w:r>
+        <w:rPr>
+          <w:rFonts w:ascii="Consolas" w:eastAsia="Times New Roman" w:hAnsi="Consolas" w:cs="Courier New"/>
+          <w:kern w:val="0"/>
+          <w:sz w:val="20"/>
+          <w:szCs w:val="20"/>
+          <w:lang w:eastAsia="en-GB"/>
+          <w14:ligatures w14:val="none"/>
+        </w:rPr>
+        <w:t>┃</w:t>
+      </w:r>
+      <w:r>
+        <w:rPr>
+          <w:rFonts w:ascii="Consolas" w:eastAsia="Times New Roman" w:hAnsi="Consolas" w:cs="Courier New"/>
+          <w:b/>
+          <w:bCs/>
+          <w:kern w:val="0"/>
+          <w:sz w:val="20"/>
+          <w:szCs w:val="20"/>
+          <w:lang w:eastAsia="en-GB"/>
+          <w14:ligatures w14:val="none"/>
+        </w:rPr>
+        <w:t xml:space="preserve">       Param # </w:t>
+      </w:r>
+      <w:r>
+        <w:rPr>
+          <w:rFonts w:ascii="Consolas" w:eastAsia="Times New Roman" w:hAnsi="Consolas" w:cs="Courier New"/>
+          <w:kern w:val="0"/>
+          <w:sz w:val="20"/>
+          <w:szCs w:val="20"/>
+          <w:lang w:eastAsia="en-GB"/>
+          <w14:ligatures w14:val="none"/>
+        </w:rPr>
+        <w:t>┃</w:t>
+      </w:r>
+    </w:p>
+    <w:p>
+      <w:pPr>
+        <w:shd w:val="clear" w:color="auto" w:fill="FFFFFF"/>
+        <w:tabs>
+          <w:tab w:val="left" w:pos="916"/>
+          <w:tab w:val="left" w:pos="1832"/>
+          <w:tab w:val="left" w:pos="2748"/>
+          <w:tab w:val="left" w:pos="3664"/>
+          <w:tab w:val="left" w:pos="4580"/>
+          <w:tab w:val="left" w:pos="5496"/>
+          <w:tab w:val="left" w:pos="6412"/>
+          <w:tab w:val="left" w:pos="7328"/>
+          <w:tab w:val="left" w:pos="8244"/>
+          <w:tab w:val="left" w:pos="9160"/>
+          <w:tab w:val="left" w:pos="10076"/>
+          <w:tab w:val="left" w:pos="10992"/>
+          <w:tab w:val="left" w:pos="11908"/>
+          <w:tab w:val="left" w:pos="12824"/>
+          <w:tab w:val="left" w:pos="13740"/>
+          <w:tab w:val="left" w:pos="14656"/>
+        </w:tabs>
+        <w:wordWrap w:val="0"/>
+        <w:spacing w:before="360" w:after="360" w:line="240" w:lineRule="auto"/>
+        <w:ind w:left="480" w:right="480"/>
+        <w:rPr>
+          <w:rFonts w:ascii="Consolas" w:eastAsia="Times New Roman" w:hAnsi="Consolas" w:cs="Courier New"/>
+          <w:kern w:val="0"/>
+          <w:sz w:val="20"/>
+          <w:szCs w:val="20"/>
+          <w:lang w:eastAsia="en-GB"/>
+          <w14:ligatures w14:val="none"/>
+        </w:rPr>
+      </w:pPr>
+      <w:r>
+        <w:rPr>
+          <w:rFonts w:ascii="Consolas" w:eastAsia="Times New Roman" w:hAnsi="Consolas" w:cs="Courier New"/>
+          <w:kern w:val="0"/>
+          <w:sz w:val="20"/>
+          <w:szCs w:val="20"/>
+          <w:lang w:eastAsia="en-GB"/>
+          <w14:ligatures w14:val="none"/>
+        </w:rPr>
+        <w:t>┡━━━━━━━━━━━━━━━━━━━━━━━━━━━━━━━━━╇━━━━━━━━━━━━━━━━━━━━━━━━╇━━━━━━━━━━━━━━━┩</w:t>
+      </w:r>
+    </w:p>
+    <w:p>
+      <w:pPr>
+        <w:shd w:val="clear" w:color="auto" w:fill="FFFFFF"/>
+        <w:tabs>
+          <w:tab w:val="left" w:pos="916"/>
+          <w:tab w:val="left" w:pos="1832"/>
+          <w:tab w:val="left" w:pos="2748"/>
+          <w:tab w:val="left" w:pos="3664"/>
+          <w:tab w:val="left" w:pos="4580"/>
+          <w:tab w:val="left" w:pos="5496"/>
+          <w:tab w:val="left" w:pos="6412"/>
+          <w:tab w:val="left" w:pos="7328"/>
+          <w:tab w:val="left" w:pos="8244"/>
+          <w:tab w:val="left" w:pos="9160"/>
+          <w:tab w:val="left" w:pos="10076"/>
+          <w:tab w:val="left" w:pos="10992"/>
+          <w:tab w:val="left" w:pos="11908"/>
+          <w:tab w:val="left" w:pos="12824"/>
+          <w:tab w:val="left" w:pos="13740"/>
+          <w:tab w:val="left" w:pos="14656"/>
+        </w:tabs>
+        <w:wordWrap w:val="0"/>
+        <w:spacing w:before="360" w:after="360" w:line="240" w:lineRule="auto"/>
+        <w:ind w:left="480" w:right="480"/>
+        <w:rPr>
+          <w:rFonts w:ascii="Consolas" w:eastAsia="Times New Roman" w:hAnsi="Consolas" w:cs="Courier New"/>
+          <w:kern w:val="0"/>
+          <w:sz w:val="20"/>
+          <w:szCs w:val="20"/>
+          <w:lang w:eastAsia="en-GB"/>
+          <w14:ligatures w14:val="none"/>
+        </w:rPr>
+      </w:pPr>
+      <w:r>
+        <w:rPr>
+          <w:rFonts w:ascii="Consolas" w:eastAsia="Times New Roman" w:hAnsi="Consolas" w:cs="Courier New"/>
+          <w:kern w:val="0"/>
+          <w:sz w:val="20"/>
+          <w:szCs w:val="20"/>
+          <w:lang w:eastAsia="en-GB"/>
+          <w14:ligatures w14:val="none"/>
+        </w:rPr>
+        <w:t>│ dense (</w:t>
+      </w:r>
+      <w:r>
+        <w:rPr>
+          <w:rFonts w:ascii="Consolas" w:eastAsia="Times New Roman" w:hAnsi="Consolas" w:cs="Courier New"/>
+          <w:color w:val="0087FF"/>
+          <w:kern w:val="0"/>
+          <w:sz w:val="20"/>
+          <w:szCs w:val="20"/>
+          <w:lang w:eastAsia="en-GB"/>
+          <w14:ligatures w14:val="none"/>
+        </w:rPr>
+        <w:t>Dense</w:t>
+      </w:r>
+      <w:r>
+        <w:rPr>
+          <w:rFonts w:ascii="Consolas" w:eastAsia="Times New Roman" w:hAnsi="Consolas" w:cs="Courier New"/>
+          <w:kern w:val="0"/>
+          <w:sz w:val="20"/>
+          <w:szCs w:val="20"/>
+          <w:lang w:eastAsia="en-GB"/>
+          <w14:ligatures w14:val="none"/>
+        </w:rPr>
+        <w:t>)                   │ (</w:t>
+      </w:r>
+      <w:r>
+        <w:rPr>
+          <w:rFonts w:ascii="Consolas" w:eastAsia="Times New Roman" w:hAnsi="Consolas" w:cs="Courier New"/>
+          <w:color w:val="00D7FF"/>
+          <w:kern w:val="0"/>
+          <w:sz w:val="20"/>
+          <w:szCs w:val="20"/>
+          <w:lang w:eastAsia="en-GB"/>
+          <w14:ligatures w14:val="none"/>
+        </w:rPr>
+        <w:t>None</w:t>
+      </w:r>
+      <w:r>
+        <w:rPr>
+          <w:rFonts w:ascii="Consolas" w:eastAsia="Times New Roman" w:hAnsi="Consolas" w:cs="Courier New"/>
+          <w:kern w:val="0"/>
+          <w:sz w:val="20"/>
+          <w:szCs w:val="20"/>
+          <w:lang w:eastAsia="en-GB"/>
+          <w14:ligatures w14:val="none"/>
+        </w:rPr>
+        <w:t xml:space="preserve">, </w:t>
+      </w:r>
+      <w:r>
+        <w:rPr>
+          <w:rFonts w:ascii="Consolas" w:eastAsia="Times New Roman" w:hAnsi="Consolas" w:cs="Courier New"/>
+          <w:color w:val="00AF00"/>
+          <w:kern w:val="0"/>
+          <w:sz w:val="20"/>
+          <w:szCs w:val="20"/>
+          <w:lang w:eastAsia="en-GB"/>
+          <w14:ligatures w14:val="none"/>
+        </w:rPr>
+        <w:t>128</w:t>
+      </w:r>
+      <w:r>
+        <w:rPr>
+          <w:rFonts w:ascii="Consolas" w:eastAsia="Times New Roman" w:hAnsi="Consolas" w:cs="Courier New"/>
+          <w:kern w:val="0"/>
+          <w:sz w:val="20"/>
+          <w:szCs w:val="20"/>
+          <w:lang w:eastAsia="en-GB"/>
+          <w14:ligatures w14:val="none"/>
+        </w:rPr>
+        <w:t xml:space="preserve">)            │         </w:t>
+      </w:r>
+      <w:r>
+        <w:rPr>
+          <w:rFonts w:ascii="Consolas" w:eastAsia="Times New Roman" w:hAnsi="Consolas" w:cs="Courier New"/>
+          <w:color w:val="00AF00"/>
+          <w:kern w:val="0"/>
+          <w:sz w:val="20"/>
+          <w:szCs w:val="20"/>
+          <w:lang w:eastAsia="en-GB"/>
+          <w14:ligatures w14:val="none"/>
+        </w:rPr>
+        <w:t>2,560</w:t>
+      </w:r>
+      <w:r>
+        <w:rPr>
+          <w:rFonts w:ascii="Consolas" w:eastAsia="Times New Roman" w:hAnsi="Consolas" w:cs="Courier New"/>
+          <w:kern w:val="0"/>
+          <w:sz w:val="20"/>
+          <w:szCs w:val="20"/>
+          <w:lang w:eastAsia="en-GB"/>
+          <w14:ligatures w14:val="none"/>
+        </w:rPr>
+        <w:t xml:space="preserve"> │</w:t>
+      </w:r>
+    </w:p>
+    <w:p>
+      <w:pPr>
+        <w:shd w:val="clear" w:color="auto" w:fill="FFFFFF"/>
+        <w:tabs>
+          <w:tab w:val="left" w:pos="916"/>
+          <w:tab w:val="left" w:pos="1832"/>
+          <w:tab w:val="left" w:pos="2748"/>
+          <w:tab w:val="left" w:pos="3664"/>
+          <w:tab w:val="left" w:pos="4580"/>
+          <w:tab w:val="left" w:pos="5496"/>
+          <w:tab w:val="left" w:pos="6412"/>
+          <w:tab w:val="left" w:pos="7328"/>
+          <w:tab w:val="left" w:pos="8244"/>
+          <w:tab w:val="left" w:pos="9160"/>
+          <w:tab w:val="left" w:pos="10076"/>
+          <w:tab w:val="left" w:pos="10992"/>
+          <w:tab w:val="left" w:pos="11908"/>
+          <w:tab w:val="left" w:pos="12824"/>
+          <w:tab w:val="left" w:pos="13740"/>
+          <w:tab w:val="left" w:pos="14656"/>
+        </w:tabs>
+        <w:wordWrap w:val="0"/>
+        <w:spacing w:before="360" w:after="360" w:line="240" w:lineRule="auto"/>
+        <w:ind w:left="480" w:right="480"/>
+        <w:rPr>
+          <w:rFonts w:ascii="Consolas" w:eastAsia="Times New Roman" w:hAnsi="Consolas" w:cs="Courier New"/>
+          <w:kern w:val="0"/>
+          <w:sz w:val="20"/>
+          <w:szCs w:val="20"/>
+          <w:lang w:eastAsia="en-GB"/>
+          <w14:ligatures w14:val="none"/>
+        </w:rPr>
+      </w:pPr>
+      <w:r>
+        <w:rPr>
+          <w:rFonts w:ascii="Consolas" w:eastAsia="Times New Roman" w:hAnsi="Consolas" w:cs="Courier New"/>
+          <w:kern w:val="0"/>
+          <w:sz w:val="20"/>
+          <w:szCs w:val="20"/>
+          <w:lang w:eastAsia="en-GB"/>
+          <w14:ligatures w14:val="none"/>
+        </w:rPr>
+        <w:t>├─────────────────────────────────┼────────────────────────┼───────────────┤</w:t>
+      </w:r>
+    </w:p>
+    <w:p>
+      <w:pPr>
+        <w:shd w:val="clear" w:color="auto" w:fill="FFFFFF"/>
+        <w:tabs>
+          <w:tab w:val="left" w:pos="916"/>
+          <w:tab w:val="left" w:pos="1832"/>
+          <w:tab w:val="left" w:pos="2748"/>
+          <w:tab w:val="left" w:pos="3664"/>
+          <w:tab w:val="left" w:pos="4580"/>
+          <w:tab w:val="left" w:pos="5496"/>
+          <w:tab w:val="left" w:pos="6412"/>
+          <w:tab w:val="left" w:pos="7328"/>
+          <w:tab w:val="left" w:pos="8244"/>
+          <w:tab w:val="left" w:pos="9160"/>
+          <w:tab w:val="left" w:pos="10076"/>
+          <w:tab w:val="left" w:pos="10992"/>
+          <w:tab w:val="left" w:pos="11908"/>
+          <w:tab w:val="left" w:pos="12824"/>
+          <w:tab w:val="left" w:pos="13740"/>
+          <w:tab w:val="left" w:pos="14656"/>
+        </w:tabs>
+        <w:wordWrap w:val="0"/>
+        <w:spacing w:before="360" w:after="360" w:line="240" w:lineRule="auto"/>
+        <w:ind w:left="480" w:right="480"/>
+        <w:rPr>
+          <w:rFonts w:ascii="Consolas" w:eastAsia="Times New Roman" w:hAnsi="Consolas" w:cs="Courier New"/>
+          <w:kern w:val="0"/>
+          <w:sz w:val="20"/>
+          <w:szCs w:val="20"/>
+          <w:lang w:eastAsia="en-GB"/>
+          <w14:ligatures w14:val="none"/>
+        </w:rPr>
+      </w:pPr>
+      <w:r>
+        <w:rPr>
+          <w:rFonts w:ascii="Consolas" w:eastAsia="Times New Roman" w:hAnsi="Consolas" w:cs="Courier New"/>
+          <w:kern w:val="0"/>
+          <w:sz w:val="20"/>
+          <w:szCs w:val="20"/>
+          <w:lang w:eastAsia="en-GB"/>
+          <w14:ligatures w14:val="none"/>
+        </w:rPr>
+        <w:t>│ dense_1 (</w:t>
+      </w:r>
+      <w:r>
+        <w:rPr>
+          <w:rFonts w:ascii="Consolas" w:eastAsia="Times New Roman" w:hAnsi="Consolas" w:cs="Courier New"/>
+          <w:color w:val="0087FF"/>
+          <w:kern w:val="0"/>
+          <w:sz w:val="20"/>
+          <w:szCs w:val="20"/>
+          <w:lang w:eastAsia="en-GB"/>
+          <w14:ligatures w14:val="none"/>
+        </w:rPr>
+        <w:t>Dense</w:t>
+      </w:r>
+      <w:r>
+        <w:rPr>
+          <w:rFonts w:ascii="Consolas" w:eastAsia="Times New Roman" w:hAnsi="Consolas" w:cs="Courier New"/>
+          <w:kern w:val="0"/>
+          <w:sz w:val="20"/>
+          <w:szCs w:val="20"/>
+          <w:lang w:eastAsia="en-GB"/>
+          <w14:ligatures w14:val="none"/>
+        </w:rPr>
+        <w:t>)                 │ (</w:t>
+      </w:r>
+      <w:r>
+        <w:rPr>
+          <w:rFonts w:ascii="Consolas" w:eastAsia="Times New Roman" w:hAnsi="Consolas" w:cs="Courier New"/>
+          <w:color w:val="00D7FF"/>
+          <w:kern w:val="0"/>
+          <w:sz w:val="20"/>
+          <w:szCs w:val="20"/>
+          <w:lang w:eastAsia="en-GB"/>
+          <w14:ligatures w14:val="none"/>
+        </w:rPr>
+        <w:t>None</w:t>
+      </w:r>
+      <w:r>
+        <w:rPr>
+          <w:rFonts w:ascii="Consolas" w:eastAsia="Times New Roman" w:hAnsi="Consolas" w:cs="Courier New"/>
+          <w:kern w:val="0"/>
+          <w:sz w:val="20"/>
+          <w:szCs w:val="20"/>
+          <w:lang w:eastAsia="en-GB"/>
+          <w14:ligatures w14:val="none"/>
+        </w:rPr>
+        <w:t xml:space="preserve">, </w:t>
+      </w:r>
+      <w:r>
+        <w:rPr>
+          <w:rFonts w:ascii="Consolas" w:eastAsia="Times New Roman" w:hAnsi="Consolas" w:cs="Courier New"/>
+          <w:color w:val="00AF00"/>
+          <w:kern w:val="0"/>
+          <w:sz w:val="20"/>
+          <w:szCs w:val="20"/>
+          <w:lang w:eastAsia="en-GB"/>
+          <w14:ligatures w14:val="none"/>
+        </w:rPr>
+        <w:t>64</w:t>
+      </w:r>
+      <w:r>
+        <w:rPr>
+          <w:rFonts w:ascii="Consolas" w:eastAsia="Times New Roman" w:hAnsi="Consolas" w:cs="Courier New"/>
+          <w:kern w:val="0"/>
+          <w:sz w:val="20"/>
+          <w:szCs w:val="20"/>
+          <w:lang w:eastAsia="en-GB"/>
+          <w14:ligatures w14:val="none"/>
+        </w:rPr>
+        <w:t xml:space="preserve">)             │         </w:t>
+      </w:r>
+      <w:r>
+        <w:rPr>
+          <w:rFonts w:ascii="Consolas" w:eastAsia="Times New Roman" w:hAnsi="Consolas" w:cs="Courier New"/>
+          <w:color w:val="00AF00"/>
+          <w:kern w:val="0"/>
+          <w:sz w:val="20"/>
+          <w:szCs w:val="20"/>
+          <w:lang w:eastAsia="en-GB"/>
+          <w14:ligatures w14:val="none"/>
+        </w:rPr>
+        <w:t>8,256</w:t>
+      </w:r>
+      <w:r>
+        <w:rPr>
+          <w:rFonts w:ascii="Consolas" w:eastAsia="Times New Roman" w:hAnsi="Consolas" w:cs="Courier New"/>
+          <w:kern w:val="0"/>
+          <w:sz w:val="20"/>
+          <w:szCs w:val="20"/>
+          <w:lang w:eastAsia="en-GB"/>
+          <w14:ligatures w14:val="none"/>
+        </w:rPr>
+        <w:t xml:space="preserve"> │</w:t>
+      </w:r>
+    </w:p>
+    <w:p>
+      <w:pPr>
+        <w:shd w:val="clear" w:color="auto" w:fill="FFFFFF"/>
+        <w:tabs>
+          <w:tab w:val="left" w:pos="916"/>
+          <w:tab w:val="left" w:pos="1832"/>
+          <w:tab w:val="left" w:pos="2748"/>
+          <w:tab w:val="left" w:pos="3664"/>
+          <w:tab w:val="left" w:pos="4580"/>
+          <w:tab w:val="left" w:pos="5496"/>
+          <w:tab w:val="left" w:pos="6412"/>
+          <w:tab w:val="left" w:pos="7328"/>
+          <w:tab w:val="left" w:pos="8244"/>
+          <w:tab w:val="left" w:pos="9160"/>
+          <w:tab w:val="left" w:pos="10076"/>
+          <w:tab w:val="left" w:pos="10992"/>
+          <w:tab w:val="left" w:pos="11908"/>
+          <w:tab w:val="left" w:pos="12824"/>
+          <w:tab w:val="left" w:pos="13740"/>
+          <w:tab w:val="left" w:pos="14656"/>
+        </w:tabs>
+        <w:wordWrap w:val="0"/>
+        <w:spacing w:before="360" w:after="360" w:line="240" w:lineRule="auto"/>
+        <w:ind w:left="480" w:right="480"/>
+        <w:rPr>
+          <w:rFonts w:ascii="Consolas" w:eastAsia="Times New Roman" w:hAnsi="Consolas" w:cs="Courier New"/>
+          <w:kern w:val="0"/>
+          <w:sz w:val="20"/>
+          <w:szCs w:val="20"/>
+          <w:lang w:eastAsia="en-GB"/>
+          <w14:ligatures w14:val="none"/>
+        </w:rPr>
+      </w:pPr>
+      <w:r>
+        <w:rPr>
+          <w:rFonts w:ascii="Consolas" w:eastAsia="Times New Roman" w:hAnsi="Consolas" w:cs="Courier New"/>
+          <w:kern w:val="0"/>
+          <w:sz w:val="20"/>
+          <w:szCs w:val="20"/>
+          <w:lang w:eastAsia="en-GB"/>
+          <w14:ligatures w14:val="none"/>
+        </w:rPr>
+        <w:t>├─────────────────────────────────┼────────────────────────┼───────────────┤</w:t>
+      </w:r>
+    </w:p>
+    <w:p>
+      <w:pPr>
+        <w:shd w:val="clear" w:color="auto" w:fill="FFFFFF"/>
+        <w:tabs>
+          <w:tab w:val="left" w:pos="916"/>
+          <w:tab w:val="left" w:pos="1832"/>
+          <w:tab w:val="left" w:pos="2748"/>
+          <w:tab w:val="left" w:pos="3664"/>
+          <w:tab w:val="left" w:pos="4580"/>
+          <w:tab w:val="left" w:pos="5496"/>
+          <w:tab w:val="left" w:pos="6412"/>
+          <w:tab w:val="left" w:pos="7328"/>
+          <w:tab w:val="left" w:pos="8244"/>
+          <w:tab w:val="left" w:pos="9160"/>
+          <w:tab w:val="left" w:pos="10076"/>
+          <w:tab w:val="left" w:pos="10992"/>
+          <w:tab w:val="left" w:pos="11908"/>
+          <w:tab w:val="left" w:pos="12824"/>
+          <w:tab w:val="left" w:pos="13740"/>
+          <w:tab w:val="left" w:pos="14656"/>
+        </w:tabs>
+        <w:wordWrap w:val="0"/>
+        <w:spacing w:before="360" w:after="360" w:line="240" w:lineRule="auto"/>
+        <w:ind w:left="480" w:right="480"/>
+        <w:rPr>
+          <w:rFonts w:ascii="Consolas" w:eastAsia="Times New Roman" w:hAnsi="Consolas" w:cs="Courier New"/>
+          <w:kern w:val="0"/>
+          <w:sz w:val="20"/>
+          <w:szCs w:val="20"/>
+          <w:lang w:eastAsia="en-GB"/>
+          <w14:ligatures w14:val="none"/>
+        </w:rPr>
+      </w:pPr>
+      <w:r>
+        <w:rPr>
+          <w:rFonts w:ascii="Consolas" w:eastAsia="Times New Roman" w:hAnsi="Consolas" w:cs="Courier New"/>
+          <w:kern w:val="0"/>
+          <w:sz w:val="20"/>
+          <w:szCs w:val="20"/>
+          <w:lang w:eastAsia="en-GB"/>
+          <w14:ligatures w14:val="none"/>
+        </w:rPr>
+        <w:lastRenderedPageBreak/>
+        <w:t>│ dense_2 (</w:t>
+      </w:r>
+      <w:r>
+        <w:rPr>
+          <w:rFonts w:ascii="Consolas" w:eastAsia="Times New Roman" w:hAnsi="Consolas" w:cs="Courier New"/>
+          <w:color w:val="0087FF"/>
+          <w:kern w:val="0"/>
+          <w:sz w:val="20"/>
+          <w:szCs w:val="20"/>
+          <w:lang w:eastAsia="en-GB"/>
+          <w14:ligatures w14:val="none"/>
+        </w:rPr>
+        <w:t>Dense</w:t>
+      </w:r>
+      <w:r>
+        <w:rPr>
+          <w:rFonts w:ascii="Consolas" w:eastAsia="Times New Roman" w:hAnsi="Consolas" w:cs="Courier New"/>
+          <w:kern w:val="0"/>
+          <w:sz w:val="20"/>
+          <w:szCs w:val="20"/>
+          <w:lang w:eastAsia="en-GB"/>
+          <w14:ligatures w14:val="none"/>
+        </w:rPr>
+        <w:t>)                 │ (</w:t>
+      </w:r>
+      <w:r>
+        <w:rPr>
+          <w:rFonts w:ascii="Consolas" w:eastAsia="Times New Roman" w:hAnsi="Consolas" w:cs="Courier New"/>
+          <w:color w:val="00D7FF"/>
+          <w:kern w:val="0"/>
+          <w:sz w:val="20"/>
+          <w:szCs w:val="20"/>
+          <w:lang w:eastAsia="en-GB"/>
+          <w14:ligatures w14:val="none"/>
+        </w:rPr>
+        <w:t>None</w:t>
+      </w:r>
+      <w:r>
+        <w:rPr>
+          <w:rFonts w:ascii="Consolas" w:eastAsia="Times New Roman" w:hAnsi="Consolas" w:cs="Courier New"/>
+          <w:kern w:val="0"/>
+          <w:sz w:val="20"/>
+          <w:szCs w:val="20"/>
+          <w:lang w:eastAsia="en-GB"/>
+          <w14:ligatures w14:val="none"/>
+        </w:rPr>
+        <w:t xml:space="preserve">, </w:t>
+      </w:r>
+      <w:r>
+        <w:rPr>
+          <w:rFonts w:ascii="Consolas" w:eastAsia="Times New Roman" w:hAnsi="Consolas" w:cs="Courier New"/>
+          <w:color w:val="00AF00"/>
+          <w:kern w:val="0"/>
+          <w:sz w:val="20"/>
+          <w:szCs w:val="20"/>
+          <w:lang w:eastAsia="en-GB"/>
+          <w14:ligatures w14:val="none"/>
+        </w:rPr>
+        <w:t>32</w:t>
+      </w:r>
+      <w:r>
+        <w:rPr>
+          <w:rFonts w:ascii="Consolas" w:eastAsia="Times New Roman" w:hAnsi="Consolas" w:cs="Courier New"/>
+          <w:kern w:val="0"/>
+          <w:sz w:val="20"/>
+          <w:szCs w:val="20"/>
+          <w:lang w:eastAsia="en-GB"/>
+          <w14:ligatures w14:val="none"/>
+        </w:rPr>
+        <w:t xml:space="preserve">)             │         </w:t>
+      </w:r>
+      <w:r>
+        <w:rPr>
+          <w:rFonts w:ascii="Consolas" w:eastAsia="Times New Roman" w:hAnsi="Consolas" w:cs="Courier New"/>
+          <w:color w:val="00AF00"/>
+          <w:kern w:val="0"/>
+          <w:sz w:val="20"/>
+          <w:szCs w:val="20"/>
+          <w:lang w:eastAsia="en-GB"/>
+          <w14:ligatures w14:val="none"/>
+        </w:rPr>
+        <w:t>2,080</w:t>
+      </w:r>
+      <w:r>
+        <w:rPr>
+          <w:rFonts w:ascii="Consolas" w:eastAsia="Times New Roman" w:hAnsi="Consolas" w:cs="Courier New"/>
+          <w:kern w:val="0"/>
+          <w:sz w:val="20"/>
+          <w:szCs w:val="20"/>
+          <w:lang w:eastAsia="en-GB"/>
+          <w14:ligatures w14:val="none"/>
+        </w:rPr>
+        <w:t xml:space="preserve"> │</w:t>
+      </w:r>
+    </w:p>
+    <w:p>
+      <w:pPr>
+        <w:shd w:val="clear" w:color="auto" w:fill="FFFFFF"/>
+        <w:tabs>
+          <w:tab w:val="left" w:pos="916"/>
+          <w:tab w:val="left" w:pos="1832"/>
+          <w:tab w:val="left" w:pos="2748"/>
+          <w:tab w:val="left" w:pos="3664"/>
+          <w:tab w:val="left" w:pos="4580"/>
+          <w:tab w:val="left" w:pos="5496"/>
+          <w:tab w:val="left" w:pos="6412"/>
+          <w:tab w:val="left" w:pos="7328"/>
+          <w:tab w:val="left" w:pos="8244"/>
+          <w:tab w:val="left" w:pos="9160"/>
+          <w:tab w:val="left" w:pos="10076"/>
+          <w:tab w:val="left" w:pos="10992"/>
+          <w:tab w:val="left" w:pos="11908"/>
+          <w:tab w:val="left" w:pos="12824"/>
+          <w:tab w:val="left" w:pos="13740"/>
+          <w:tab w:val="left" w:pos="14656"/>
+        </w:tabs>
+        <w:wordWrap w:val="0"/>
+        <w:spacing w:before="360" w:after="360" w:line="240" w:lineRule="auto"/>
+        <w:ind w:left="480" w:right="480"/>
+        <w:rPr>
+          <w:rFonts w:ascii="Consolas" w:eastAsia="Times New Roman" w:hAnsi="Consolas" w:cs="Courier New"/>
+          <w:kern w:val="0"/>
+          <w:sz w:val="20"/>
+          <w:szCs w:val="20"/>
+          <w:lang w:eastAsia="en-GB"/>
+          <w14:ligatures w14:val="none"/>
+        </w:rPr>
+      </w:pPr>
+      <w:r>
+        <w:rPr>
+          <w:rFonts w:ascii="Consolas" w:eastAsia="Times New Roman" w:hAnsi="Consolas" w:cs="Courier New"/>
+          <w:kern w:val="0"/>
+          <w:sz w:val="20"/>
+          <w:szCs w:val="20"/>
+          <w:lang w:eastAsia="en-GB"/>
+          <w14:ligatures w14:val="none"/>
+        </w:rPr>
+        <w:t>├─────────────────────────────────┼────────────────────────┼───────────────┤</w:t>
+      </w:r>
+    </w:p>
+    <w:p>
+      <w:pPr>
+        <w:shd w:val="clear" w:color="auto" w:fill="FFFFFF"/>
+        <w:tabs>
+          <w:tab w:val="left" w:pos="916"/>
+          <w:tab w:val="left" w:pos="1832"/>
+          <w:tab w:val="left" w:pos="2748"/>
+          <w:tab w:val="left" w:pos="3664"/>
+          <w:tab w:val="left" w:pos="4580"/>
+          <w:tab w:val="left" w:pos="5496"/>
+          <w:tab w:val="left" w:pos="6412"/>
+          <w:tab w:val="left" w:pos="7328"/>
+          <w:tab w:val="left" w:pos="8244"/>
+          <w:tab w:val="left" w:pos="9160"/>
+          <w:tab w:val="left" w:pos="10076"/>
+          <w:tab w:val="left" w:pos="10992"/>
+          <w:tab w:val="left" w:pos="11908"/>
+          <w:tab w:val="left" w:pos="12824"/>
+          <w:tab w:val="left" w:pos="13740"/>
+          <w:tab w:val="left" w:pos="14656"/>
+        </w:tabs>
+        <w:wordWrap w:val="0"/>
+        <w:spacing w:before="360" w:after="360" w:line="240" w:lineRule="auto"/>
+        <w:ind w:left="480" w:right="480"/>
+        <w:rPr>
+          <w:rFonts w:ascii="Consolas" w:eastAsia="Times New Roman" w:hAnsi="Consolas" w:cs="Courier New"/>
+          <w:kern w:val="0"/>
+          <w:sz w:val="20"/>
+          <w:szCs w:val="20"/>
+          <w:lang w:eastAsia="en-GB"/>
+          <w14:ligatures w14:val="none"/>
+        </w:rPr>
+      </w:pPr>
+      <w:r>
+        <w:rPr>
+          <w:rFonts w:ascii="Consolas" w:eastAsia="Times New Roman" w:hAnsi="Consolas" w:cs="Courier New"/>
+          <w:kern w:val="0"/>
+          <w:sz w:val="20"/>
+          <w:szCs w:val="20"/>
+          <w:lang w:eastAsia="en-GB"/>
+          <w14:ligatures w14:val="none"/>
+        </w:rPr>
+        <w:t>│ dense_3 (</w:t>
+      </w:r>
+      <w:r>
+        <w:rPr>
+          <w:rFonts w:ascii="Consolas" w:eastAsia="Times New Roman" w:hAnsi="Consolas" w:cs="Courier New"/>
+          <w:color w:val="0087FF"/>
+          <w:kern w:val="0"/>
+          <w:sz w:val="20"/>
+          <w:szCs w:val="20"/>
+          <w:lang w:eastAsia="en-GB"/>
+          <w14:ligatures w14:val="none"/>
+        </w:rPr>
+        <w:t>Dense</w:t>
+      </w:r>
+      <w:r>
+        <w:rPr>
+          <w:rFonts w:ascii="Consolas" w:eastAsia="Times New Roman" w:hAnsi="Consolas" w:cs="Courier New"/>
+          <w:kern w:val="0"/>
+          <w:sz w:val="20"/>
+          <w:szCs w:val="20"/>
+          <w:lang w:eastAsia="en-GB"/>
+          <w14:ligatures w14:val="none"/>
+        </w:rPr>
+        <w:t>)                 │ (</w:t>
+      </w:r>
+      <w:r>
+        <w:rPr>
+          <w:rFonts w:ascii="Consolas" w:eastAsia="Times New Roman" w:hAnsi="Consolas" w:cs="Courier New"/>
+          <w:color w:val="00D7FF"/>
+          <w:kern w:val="0"/>
+          <w:sz w:val="20"/>
+          <w:szCs w:val="20"/>
+          <w:lang w:eastAsia="en-GB"/>
+          <w14:ligatures w14:val="none"/>
+        </w:rPr>
+        <w:t>None</w:t>
+      </w:r>
+      <w:r>
+        <w:rPr>
+          <w:rFonts w:ascii="Consolas" w:eastAsia="Times New Roman" w:hAnsi="Consolas" w:cs="Courier New"/>
+          <w:kern w:val="0"/>
+          <w:sz w:val="20"/>
+          <w:szCs w:val="20"/>
+          <w:lang w:eastAsia="en-GB"/>
+          <w14:ligatures w14:val="none"/>
+        </w:rPr>
+        <w:t xml:space="preserve">, </w:t>
+      </w:r>
+      <w:r>
+        <w:rPr>
+          <w:rFonts w:ascii="Consolas" w:eastAsia="Times New Roman" w:hAnsi="Consolas" w:cs="Courier New"/>
+          <w:color w:val="00AF00"/>
+          <w:kern w:val="0"/>
+          <w:sz w:val="20"/>
+          <w:szCs w:val="20"/>
+          <w:lang w:eastAsia="en-GB"/>
+          <w14:ligatures w14:val="none"/>
+        </w:rPr>
+        <w:t>1</w:t>
+      </w:r>
+      <w:r>
+        <w:rPr>
+          <w:rFonts w:ascii="Consolas" w:eastAsia="Times New Roman" w:hAnsi="Consolas" w:cs="Courier New"/>
+          <w:kern w:val="0"/>
+          <w:sz w:val="20"/>
+          <w:szCs w:val="20"/>
+          <w:lang w:eastAsia="en-GB"/>
+          <w14:ligatures w14:val="none"/>
+        </w:rPr>
+        <w:t xml:space="preserve">)              │            </w:t>
+      </w:r>
+      <w:r>
+        <w:rPr>
+          <w:rFonts w:ascii="Consolas" w:eastAsia="Times New Roman" w:hAnsi="Consolas" w:cs="Courier New"/>
+          <w:color w:val="00AF00"/>
+          <w:kern w:val="0"/>
+          <w:sz w:val="20"/>
+          <w:szCs w:val="20"/>
+          <w:lang w:eastAsia="en-GB"/>
+          <w14:ligatures w14:val="none"/>
+        </w:rPr>
+        <w:t>33</w:t>
+      </w:r>
+      <w:r>
+        <w:rPr>
+          <w:rFonts w:ascii="Consolas" w:eastAsia="Times New Roman" w:hAnsi="Consolas" w:cs="Courier New"/>
+          <w:kern w:val="0"/>
+          <w:sz w:val="20"/>
+          <w:szCs w:val="20"/>
+          <w:lang w:eastAsia="en-GB"/>
+          <w14:ligatures w14:val="none"/>
+        </w:rPr>
+        <w:t xml:space="preserve"> │</w:t>
+      </w:r>
+    </w:p>
+    <w:p>
+      <w:pPr>
+        <w:shd w:val="clear" w:color="auto" w:fill="FFFFFF"/>
+        <w:tabs>
+          <w:tab w:val="left" w:pos="916"/>
+          <w:tab w:val="left" w:pos="1832"/>
+          <w:tab w:val="left" w:pos="2748"/>
+          <w:tab w:val="left" w:pos="3664"/>
+          <w:tab w:val="left" w:pos="4580"/>
+          <w:tab w:val="left" w:pos="5496"/>
+          <w:tab w:val="left" w:pos="6412"/>
+          <w:tab w:val="left" w:pos="7328"/>
+          <w:tab w:val="left" w:pos="8244"/>
+          <w:tab w:val="left" w:pos="9160"/>
+          <w:tab w:val="left" w:pos="10076"/>
+          <w:tab w:val="left" w:pos="10992"/>
+          <w:tab w:val="left" w:pos="11908"/>
+          <w:tab w:val="left" w:pos="12824"/>
+          <w:tab w:val="left" w:pos="13740"/>
+          <w:tab w:val="left" w:pos="14656"/>
+        </w:tabs>
+        <w:wordWrap w:val="0"/>
+        <w:spacing w:before="360" w:after="360" w:line="240" w:lineRule="auto"/>
+        <w:ind w:left="480" w:right="480"/>
+        <w:rPr>
+          <w:rFonts w:ascii="Consolas" w:eastAsia="Times New Roman" w:hAnsi="Consolas" w:cs="Courier New"/>
+          <w:kern w:val="0"/>
+          <w:sz w:val="20"/>
+          <w:szCs w:val="20"/>
+          <w:lang w:eastAsia="en-GB"/>
+          <w14:ligatures w14:val="none"/>
+        </w:rPr>
+      </w:pPr>
+      <w:r>
+        <w:rPr>
+          <w:rFonts w:ascii="Consolas" w:eastAsia="Times New Roman" w:hAnsi="Consolas" w:cs="Courier New"/>
+          <w:kern w:val="0"/>
+          <w:sz w:val="20"/>
+          <w:szCs w:val="20"/>
+          <w:lang w:eastAsia="en-GB"/>
+          <w14:ligatures w14:val="none"/>
+        </w:rPr>
+        <w:t>└─────────────────────────────────┴────────────────────────┴───────────────┘</w:t>
+      </w:r>
+    </w:p>
+    <w:p>
+      <w:pPr>
+        <w:shd w:val="clear" w:color="auto" w:fill="FFFFFF"/>
+        <w:tabs>
+          <w:tab w:val="left" w:pos="916"/>
+          <w:tab w:val="left" w:pos="1832"/>
+          <w:tab w:val="left" w:pos="2748"/>
+          <w:tab w:val="left" w:pos="3664"/>
+          <w:tab w:val="left" w:pos="4580"/>
+          <w:tab w:val="left" w:pos="5496"/>
+          <w:tab w:val="left" w:pos="6412"/>
+          <w:tab w:val="left" w:pos="7328"/>
+          <w:tab w:val="left" w:pos="8244"/>
+          <w:tab w:val="left" w:pos="9160"/>
+          <w:tab w:val="left" w:pos="10076"/>
+          <w:tab w:val="left" w:pos="10992"/>
+          <w:tab w:val="left" w:pos="11908"/>
+          <w:tab w:val="left" w:pos="12824"/>
+          <w:tab w:val="left" w:pos="13740"/>
+          <w:tab w:val="left" w:pos="14656"/>
+        </w:tabs>
+        <w:wordWrap w:val="0"/>
+        <w:spacing w:before="360" w:after="360" w:line="240" w:lineRule="auto"/>
+        <w:ind w:left="480" w:right="480"/>
+        <w:rPr>
+          <w:rFonts w:ascii="Consolas" w:eastAsia="Times New Roman" w:hAnsi="Consolas" w:cs="Courier New"/>
+          <w:kern w:val="0"/>
+          <w:sz w:val="20"/>
+          <w:szCs w:val="20"/>
+          <w:lang w:eastAsia="en-GB"/>
+          <w14:ligatures w14:val="none"/>
+        </w:rPr>
+      </w:pPr>
+      <w:r>
+        <w:rPr>
+          <w:rFonts w:ascii="Consolas" w:eastAsia="Times New Roman" w:hAnsi="Consolas" w:cs="Courier New"/>
+          <w:b/>
+          <w:bCs/>
+          <w:kern w:val="0"/>
+          <w:sz w:val="20"/>
+          <w:szCs w:val="20"/>
+          <w:lang w:eastAsia="en-GB"/>
+          <w14:ligatures w14:val="none"/>
+        </w:rPr>
+        <w:t xml:space="preserve"> Total params: </w:t>
+      </w:r>
+      <w:r>
+        <w:rPr>
+          <w:rFonts w:ascii="Consolas" w:eastAsia="Times New Roman" w:hAnsi="Consolas" w:cs="Courier New"/>
+          <w:color w:val="00AF00"/>
+          <w:kern w:val="0"/>
+          <w:sz w:val="20"/>
+          <w:szCs w:val="20"/>
+          <w:lang w:eastAsia="en-GB"/>
+          <w14:ligatures w14:val="none"/>
+        </w:rPr>
+        <w:t>38,789</w:t>
+      </w:r>
+      <w:r>
+        <w:rPr>
+          <w:rFonts w:ascii="Consolas" w:eastAsia="Times New Roman" w:hAnsi="Consolas" w:cs="Courier New"/>
+          <w:kern w:val="0"/>
+          <w:sz w:val="20"/>
+          <w:szCs w:val="20"/>
+          <w:lang w:eastAsia="en-GB"/>
+          <w14:ligatures w14:val="none"/>
+        </w:rPr>
+        <w:t xml:space="preserve"> (151.52 KB)</w:t>
+      </w:r>
+    </w:p>
+    <w:p>
+      <w:pPr>
+        <w:shd w:val="clear" w:color="auto" w:fill="FFFFFF"/>
+        <w:tabs>
+          <w:tab w:val="left" w:pos="916"/>
+          <w:tab w:val="left" w:pos="1832"/>
+          <w:tab w:val="left" w:pos="2748"/>
+          <w:tab w:val="left" w:pos="3664"/>
+          <w:tab w:val="left" w:pos="4580"/>
+          <w:tab w:val="left" w:pos="5496"/>
+          <w:tab w:val="left" w:pos="6412"/>
+          <w:tab w:val="left" w:pos="7328"/>
+          <w:tab w:val="left" w:pos="8244"/>
+          <w:tab w:val="left" w:pos="9160"/>
+          <w:tab w:val="left" w:pos="10076"/>
+          <w:tab w:val="left" w:pos="10992"/>
+          <w:tab w:val="left" w:pos="11908"/>
+          <w:tab w:val="left" w:pos="12824"/>
+          <w:tab w:val="left" w:pos="13740"/>
+          <w:tab w:val="left" w:pos="14656"/>
+        </w:tabs>
+        <w:wordWrap w:val="0"/>
+        <w:spacing w:before="360" w:after="360" w:line="240" w:lineRule="auto"/>
+        <w:ind w:left="480" w:right="480"/>
+        <w:rPr>
+          <w:rFonts w:ascii="Consolas" w:eastAsia="Times New Roman" w:hAnsi="Consolas" w:cs="Courier New"/>
+          <w:kern w:val="0"/>
+          <w:sz w:val="20"/>
+          <w:szCs w:val="20"/>
+          <w:lang w:eastAsia="en-GB"/>
+          <w14:ligatures w14:val="none"/>
+        </w:rPr>
+      </w:pPr>
+      <w:r>
+        <w:rPr>
+          <w:rFonts w:ascii="Consolas" w:eastAsia="Times New Roman" w:hAnsi="Consolas" w:cs="Courier New"/>
+          <w:b/>
+          <w:bCs/>
+          <w:kern w:val="0"/>
+          <w:sz w:val="20"/>
+          <w:szCs w:val="20"/>
+          <w:lang w:eastAsia="en-GB"/>
+          <w14:ligatures w14:val="none"/>
+        </w:rPr>
+        <w:t xml:space="preserve"> Trainable params: </w:t>
+      </w:r>
+      <w:r>
+        <w:rPr>
+          <w:rFonts w:ascii="Consolas" w:eastAsia="Times New Roman" w:hAnsi="Consolas" w:cs="Courier New"/>
+          <w:color w:val="00AF00"/>
+          <w:kern w:val="0"/>
+          <w:sz w:val="20"/>
+          <w:szCs w:val="20"/>
+          <w:lang w:eastAsia="en-GB"/>
+          <w14:ligatures w14:val="none"/>
+        </w:rPr>
+        <w:t>12,929</w:t>
+      </w:r>
+      <w:r>
+        <w:rPr>
+          <w:rFonts w:ascii="Consolas" w:eastAsia="Times New Roman" w:hAnsi="Consolas" w:cs="Courier New"/>
+          <w:kern w:val="0"/>
+          <w:sz w:val="20"/>
+          <w:szCs w:val="20"/>
+          <w:lang w:eastAsia="en-GB"/>
+          <w14:ligatures w14:val="none"/>
+        </w:rPr>
+        <w:t xml:space="preserve"> (50.50 KB)</w:t>
+      </w:r>
+    </w:p>
+    <w:p>
+      <w:pPr>
+        <w:shd w:val="clear" w:color="auto" w:fill="FFFFFF"/>
+        <w:tabs>
+          <w:tab w:val="left" w:pos="916"/>
+          <w:tab w:val="left" w:pos="1832"/>
+          <w:tab w:val="left" w:pos="2748"/>
+          <w:tab w:val="left" w:pos="3664"/>
+          <w:tab w:val="left" w:pos="4580"/>
+          <w:tab w:val="left" w:pos="5496"/>
+          <w:tab w:val="left" w:pos="6412"/>
+          <w:tab w:val="left" w:pos="7328"/>
+          <w:tab w:val="left" w:pos="8244"/>
+          <w:tab w:val="left" w:pos="9160"/>
+          <w:tab w:val="left" w:pos="10076"/>
+          <w:tab w:val="left" w:pos="10992"/>
+          <w:tab w:val="left" w:pos="11908"/>
+          <w:tab w:val="left" w:pos="12824"/>
+          <w:tab w:val="left" w:pos="13740"/>
+          <w:tab w:val="left" w:pos="14656"/>
+        </w:tabs>
+        <w:wordWrap w:val="0"/>
+        <w:spacing w:before="360" w:after="360" w:line="240" w:lineRule="auto"/>
+        <w:ind w:left="480" w:right="480"/>
+        <w:rPr>
+          <w:rFonts w:ascii="Consolas" w:eastAsia="Times New Roman" w:hAnsi="Consolas" w:cs="Courier New"/>
+          <w:kern w:val="0"/>
+          <w:sz w:val="20"/>
+          <w:szCs w:val="20"/>
+          <w:lang w:eastAsia="en-GB"/>
+          <w14:ligatures w14:val="none"/>
+        </w:rPr>
+      </w:pPr>
+      <w:r>
+        <w:rPr>
+          <w:rFonts w:ascii="Consolas" w:eastAsia="Times New Roman" w:hAnsi="Consolas" w:cs="Courier New"/>
+          <w:b/>
+          <w:bCs/>
+          <w:kern w:val="0"/>
+          <w:sz w:val="20"/>
+          <w:szCs w:val="20"/>
+          <w:lang w:eastAsia="en-GB"/>
+          <w14:ligatures w14:val="none"/>
+        </w:rPr>
+        <w:t xml:space="preserve"> Non-trainable params: </w:t>
+      </w:r>
+      <w:r>
+        <w:rPr>
+          <w:rFonts w:ascii="Consolas" w:eastAsia="Times New Roman" w:hAnsi="Consolas" w:cs="Courier New"/>
+          <w:color w:val="00AF00"/>
+          <w:kern w:val="0"/>
+          <w:sz w:val="20"/>
+          <w:szCs w:val="20"/>
+          <w:lang w:eastAsia="en-GB"/>
+          <w14:ligatures w14:val="none"/>
+        </w:rPr>
+        <w:t>0</w:t>
+      </w:r>
+      <w:r>
+        <w:rPr>
+          <w:rFonts w:ascii="Consolas" w:eastAsia="Times New Roman" w:hAnsi="Consolas" w:cs="Courier New"/>
+          <w:kern w:val="0"/>
+          <w:sz w:val="20"/>
+          <w:szCs w:val="20"/>
+          <w:lang w:eastAsia="en-GB"/>
+          <w14:ligatures w14:val="none"/>
+        </w:rPr>
+        <w:t xml:space="preserve"> (0.00 B)</w:t>
+      </w:r>
+    </w:p>
+    <w:p>
+      <w:pPr>
+        <w:shd w:val="clear" w:color="auto" w:fill="FFFFFF"/>
+        <w:tabs>
+          <w:tab w:val="left" w:pos="916"/>
+          <w:tab w:val="left" w:pos="1832"/>
+          <w:tab w:val="left" w:pos="2748"/>
+          <w:tab w:val="left" w:pos="3664"/>
+          <w:tab w:val="left" w:pos="4580"/>
+          <w:tab w:val="left" w:pos="5496"/>
+          <w:tab w:val="left" w:pos="6412"/>
+          <w:tab w:val="left" w:pos="7328"/>
+          <w:tab w:val="left" w:pos="8244"/>
+          <w:tab w:val="left" w:pos="9160"/>
+          <w:tab w:val="left" w:pos="10076"/>
+          <w:tab w:val="left" w:pos="10992"/>
+          <w:tab w:val="left" w:pos="11908"/>
+          <w:tab w:val="left" w:pos="12824"/>
+          <w:tab w:val="left" w:pos="13740"/>
+          <w:tab w:val="left" w:pos="14656"/>
+        </w:tabs>
+        <w:wordWrap w:val="0"/>
+        <w:spacing w:before="360" w:after="360" w:line="240" w:lineRule="auto"/>
+        <w:ind w:left="480" w:right="480"/>
+        <w:rPr>
+          <w:rFonts w:ascii="Consolas" w:eastAsia="Times New Roman" w:hAnsi="Consolas" w:cs="Courier New"/>
+          <w:kern w:val="0"/>
+          <w:sz w:val="20"/>
+          <w:szCs w:val="20"/>
+          <w:lang w:eastAsia="en-GB"/>
+          <w14:ligatures w14:val="none"/>
+        </w:rPr>
+      </w:pPr>
+      <w:r>
+        <w:rPr>
+          <w:rFonts w:ascii="Consolas" w:eastAsia="Times New Roman" w:hAnsi="Consolas" w:cs="Courier New"/>
+          <w:b/>
+          <w:bCs/>
+          <w:kern w:val="0"/>
+          <w:sz w:val="20"/>
+          <w:szCs w:val="20"/>
+          <w:lang w:eastAsia="en-GB"/>
+          <w14:ligatures w14:val="none"/>
+        </w:rPr>
+        <w:t xml:space="preserve"> Optimizer params: </w:t>
+      </w:r>
+      <w:r>
+        <w:rPr>
+          <w:rFonts w:ascii="Consolas" w:eastAsia="Times New Roman" w:hAnsi="Consolas" w:cs="Courier New"/>
+          <w:color w:val="00AF00"/>
+          <w:kern w:val="0"/>
+          <w:sz w:val="20"/>
+          <w:szCs w:val="20"/>
+          <w:lang w:eastAsia="en-GB"/>
+          <w14:ligatures w14:val="none"/>
+        </w:rPr>
+        <w:t>25,860</w:t>
+      </w:r>
+      <w:r>
+        <w:rPr>
+          <w:rFonts w:ascii="Consolas" w:eastAsia="Times New Roman" w:hAnsi="Consolas" w:cs="Courier New"/>
+          <w:kern w:val="0"/>
+          <w:sz w:val="20"/>
+          <w:szCs w:val="20"/>
+          <w:lang w:eastAsia="en-GB"/>
+          <w14:ligatures w14:val="none"/>
+        </w:rPr>
+        <w:t xml:space="preserve"> (101.02 KB)</w:t>
+      </w:r>
     </w:p>
     <w:p>
       <w:pPr>
@@ -2046,24 +3426,24 @@
           <w:u w:val="single"/>
         </w:rPr>
       </w:pPr>
-      <w:r>
+    </w:p>
+    <w:p>
+      <w:pPr>
+        <w:jc w:val="both"/>
         <w:rPr>
           <w:sz w:val="44"/>
           <w:szCs w:val="44"/>
           <w:u w:val="single"/>
         </w:rPr>
-        <w:t>Lab 5</w:t>
-      </w:r>
-    </w:p>
-    <w:p>
-      <w:pPr>
-        <w:jc w:val="both"/>
+      </w:pPr>
+      <w:r>
         <w:rPr>
           <w:sz w:val="44"/>
           <w:szCs w:val="44"/>
           <w:u w:val="single"/>
         </w:rPr>
-      </w:pPr>
+        <w:t>Lab 5</w:t>
+      </w:r>
     </w:p>
     <w:p>
       <w:pPr>
@@ -2074,24 +3454,24 @@
           <w:u w:val="single"/>
         </w:rPr>
       </w:pPr>
-      <w:r>
+    </w:p>
+    <w:p>
+      <w:pPr>
+        <w:jc w:val="both"/>
         <w:rPr>
           <w:sz w:val="44"/>
           <w:szCs w:val="44"/>
           <w:u w:val="single"/>
         </w:rPr>
-        <w:t>Lab 6</w:t>
-      </w:r>
-    </w:p>
-    <w:p>
-      <w:pPr>
-        <w:jc w:val="both"/>
+      </w:pPr>
+      <w:r>
         <w:rPr>
           <w:sz w:val="44"/>
           <w:szCs w:val="44"/>
           <w:u w:val="single"/>
         </w:rPr>
-      </w:pPr>
+        <w:t>Lab 6</w:t>
+      </w:r>
     </w:p>
     <w:p>
       <w:pPr>
@@ -2102,24 +3482,24 @@
           <w:u w:val="single"/>
         </w:rPr>
       </w:pPr>
-      <w:r>
+    </w:p>
+    <w:p>
+      <w:pPr>
+        <w:jc w:val="both"/>
         <w:rPr>
           <w:sz w:val="44"/>
           <w:szCs w:val="44"/>
           <w:u w:val="single"/>
         </w:rPr>
-        <w:t>Lab 7</w:t>
-      </w:r>
-    </w:p>
-    <w:p>
-      <w:pPr>
-        <w:jc w:val="both"/>
+      </w:pPr>
+      <w:r>
         <w:rPr>
           <w:sz w:val="44"/>
           <w:szCs w:val="44"/>
           <w:u w:val="single"/>
         </w:rPr>
-      </w:pPr>
+        <w:t>Lab 7</w:t>
+      </w:r>
     </w:p>
     <w:p>
       <w:pPr>
@@ -2130,24 +3510,24 @@
           <w:u w:val="single"/>
         </w:rPr>
       </w:pPr>
-      <w:r>
+    </w:p>
+    <w:p>
+      <w:pPr>
+        <w:jc w:val="both"/>
         <w:rPr>
           <w:sz w:val="44"/>
           <w:szCs w:val="44"/>
           <w:u w:val="single"/>
         </w:rPr>
-        <w:t>Lab 8</w:t>
-      </w:r>
-    </w:p>
-    <w:p>
-      <w:pPr>
-        <w:jc w:val="both"/>
+      </w:pPr>
+      <w:r>
         <w:rPr>
           <w:sz w:val="44"/>
           <w:szCs w:val="44"/>
           <w:u w:val="single"/>
         </w:rPr>
-      </w:pPr>
+        <w:t>Lab 8</w:t>
+      </w:r>
     </w:p>
     <w:p>
       <w:pPr>
@@ -2158,24 +3538,24 @@
           <w:u w:val="single"/>
         </w:rPr>
       </w:pPr>
-      <w:r>
+    </w:p>
+    <w:p>
+      <w:pPr>
+        <w:jc w:val="both"/>
         <w:rPr>
           <w:sz w:val="44"/>
           <w:szCs w:val="44"/>
           <w:u w:val="single"/>
         </w:rPr>
-        <w:t xml:space="preserve">Lab 9 </w:t>
-      </w:r>
-    </w:p>
-    <w:p>
-      <w:pPr>
-        <w:jc w:val="both"/>
+      </w:pPr>
+      <w:r>
         <w:rPr>
           <w:sz w:val="44"/>
           <w:szCs w:val="44"/>
           <w:u w:val="single"/>
         </w:rPr>
-      </w:pPr>
+        <w:t xml:space="preserve">Lab 9 </w:t>
+      </w:r>
     </w:p>
     <w:p>
       <w:pPr>
@@ -2186,24 +3566,25 @@
           <w:u w:val="single"/>
         </w:rPr>
       </w:pPr>
-      <w:r>
+    </w:p>
+    <w:p>
+      <w:pPr>
+        <w:jc w:val="both"/>
         <w:rPr>
           <w:sz w:val="44"/>
           <w:szCs w:val="44"/>
           <w:u w:val="single"/>
         </w:rPr>
-        <w:t>Lab 10</w:t>
-      </w:r>
-    </w:p>
-    <w:p>
-      <w:pPr>
-        <w:jc w:val="both"/>
+      </w:pPr>
+      <w:r>
         <w:rPr>
           <w:sz w:val="44"/>
           <w:szCs w:val="44"/>
           <w:u w:val="single"/>
         </w:rPr>
-      </w:pPr>
+        <w:lastRenderedPageBreak/>
+        <w:t>Lab 10</w:t>
+      </w:r>
     </w:p>
     <w:p>
       <w:pPr>
@@ -2214,40 +3595,49 @@
           <w:u w:val="single"/>
         </w:rPr>
       </w:pPr>
-      <w:r>
+    </w:p>
+    <w:p>
+      <w:pPr>
+        <w:jc w:val="both"/>
         <w:rPr>
           <w:sz w:val="44"/>
           <w:szCs w:val="44"/>
           <w:u w:val="single"/>
         </w:rPr>
-        <w:t>Lab 11</w:t>
-      </w:r>
-    </w:p>
-    <w:p>
-      <w:pPr>
-        <w:jc w:val="both"/>
-        <w:rPr>
-          <w:sz w:val="44"/>
-          <w:szCs w:val="44"/>
-        </w:rPr>
-      </w:pPr>
-    </w:p>
-    <w:p>
-      <w:pPr>
-        <w:jc w:val="both"/>
+      </w:pPr>
+      <w:r>
         <w:rPr>
           <w:sz w:val="44"/>
           <w:szCs w:val="44"/>
           <w:u w:val="single"/>
         </w:rPr>
-      </w:pPr>
-      <w:r>
+        <w:t>Lab 11</w:t>
+      </w:r>
+    </w:p>
+    <w:p>
+      <w:pPr>
+        <w:jc w:val="both"/>
+        <w:rPr>
+          <w:sz w:val="44"/>
+          <w:szCs w:val="44"/>
+        </w:rPr>
+      </w:pPr>
+    </w:p>
+    <w:p>
+      <w:pPr>
+        <w:jc w:val="both"/>
         <w:rPr>
           <w:sz w:val="44"/>
           <w:szCs w:val="44"/>
           <w:u w:val="single"/>
         </w:rPr>
-        <w:lastRenderedPageBreak/>
+      </w:pPr>
+      <w:r>
+        <w:rPr>
+          <w:sz w:val="44"/>
+          <w:szCs w:val="44"/>
+          <w:u w:val="single"/>
+        </w:rPr>
         <w:t>Lab 12</w:t>
       </w:r>
     </w:p>

</xml_diff>